<commit_message>
feat: ajout de vérifications et recommandations SEO dans le Plan d'action
</commit_message>
<xml_diff>
--- a/livrables/challenge-1/Plan-Action-SEO-ClaudeAgency-juin2026.docx
+++ b/livrables/challenge-1/Plan-Action-SEO-ClaudeAgency-juin2026.docx
@@ -292,6 +292,20 @@
           <w:szCs w:val="22"/>
         </w:rPr>
         <w:t xml:space="preserve">Domaine récent : aucun backlink externe significatif identifié à ce jour. C'est attendu pour un site qui vient de démarrer son référencement, mais c'est un chantier à ouvrir dès que le contenu et l'on-page seront stabilisés (voir §4.B).</w:t>
+      </w:r>
+    </w:p>
+    <w:p>
+      <w:pPr>
+        <w:spacing w:after="160"/>
+      </w:pPr>
+      <w:r>
+        <w:rPr>
+          <w:rFonts w:ascii="Arial" w:hAnsi="Arial"/>
+          <w:i/>
+          <w:color w:val="2B2724"/>
+          <w:sz w:val="22"/>
+        </w:rPr>
+        <w:t>Vérification Ahrefs (outils gratuits, sans compte, 25 juin 2026) : Domain Rating (DR) de 0, 2 backlinks dont 50 % en dofollow, et 2 domaines référents (linking websites) dont 50 % en dofollow. Ces chiffres confirment le diagnostic ci-dessus — le netlinking reste un chantier à ouvrir, pas encore entamé.</w:t>
       </w:r>
     </w:p>
     <w:p>
@@ -1766,6 +1780,34 @@
           <w:szCs w:val="22"/>
         </w:rPr>
         <w:t xml:space="preserve"/>
+      </w:r>
+    </w:p>
+    <w:p>
+      <w:pPr>
+        <w:pStyle w:val="Heading2"/>
+        <w:spacing w:after="120" w:before="280"/>
+      </w:pPr>
+      <w:r>
+        <w:rPr>
+          <w:rFonts w:ascii="Arial" w:hAnsi="Arial"/>
+          <w:b/>
+          <w:color w:val="2B2724"/>
+          <w:sz w:val="24"/>
+        </w:rPr>
+        <w:t>Vérification de 4 mots-clés de suivi (Ahrefs, 25 juin 2026)</w:t>
+      </w:r>
+    </w:p>
+    <w:p>
+      <w:pPr>
+        <w:spacing w:after="160"/>
+      </w:pPr>
+      <w:r>
+        <w:rPr>
+          <w:rFonts w:ascii="Arial" w:hAnsi="Arial"/>
+          <w:color w:val="2B2724"/>
+          <w:sz w:val="22"/>
+        </w:rPr>
+        <w:t>Quatre mots-clés proposés en complément du cluster ci-dessus — « agence SEO organisme de formation », « automatisation Qualiopi », « IA pour organisme de formation » et « agence IA formation professionnelle » — ont été passés dans le Keyword Generator gratuit d'Ahrefs (sans compte, périmètre France). Résultat identique pour les quatre : aucune idée de mot-clé ni donnée de volume de recherche ou de difficulté (KD) renvoyée. Ce n'est pas une absence de demande réelle, mais une limite connue de l'outil gratuit : ces requêtes B2B très spécifiques sont en dessous du seuil de couverture qu'Ahrefs applique à sa version sans compte. Pour des chiffres fiables sur ce type de mots-clés de longue traîne, il faudra passer par Google Keyword Planner (gratuit avec un compte Google Ads) ou par un compte Ahrefs/DataForSEO payant.</w:t>
       </w:r>
     </w:p>
     <w:p>

</xml_diff>

<commit_message>
feat(seo): gap-pass post-livraison — audit complet + 5 audits page + clustering + GEO + §8 du Plan d'action
</commit_message>
<xml_diff>
--- a/livrables/challenge-1/Plan-Action-SEO-ClaudeAgency-juin2026.docx
+++ b/livrables/challenge-1/Plan-Action-SEO-ClaudeAgency-juin2026.docx
@@ -2409,6 +2409,112 @@
           <w:szCs w:val="22"/>
         </w:rPr>
         <w:t xml:space="preserve">Revoir les KPI Search Console dans 4 semaines pour mesurer la progression.</w:t>
+      </w:r>
+    </w:p>
+    <w:p>
+      <w:pPr>
+        <w:pStyle w:val="Heading1"/>
+      </w:pPr>
+      <w:r>
+        <w:t>8. Mise à jour 26/06/2026 — Gap-pass post-livraison Semaine 1</w:t>
+      </w:r>
+    </w:p>
+    <w:p>
+      <w:r>
+        <w:t>Compléments à ce Plan d'action, post-livraison initiale, avec audits relancés sur le site live et croisement avec les exigences précises du brief Notion Semaine 1.</w:t>
+      </w:r>
+    </w:p>
+    <w:p>
+      <w:pPr>
+        <w:pStyle w:val="Heading2"/>
+      </w:pPr>
+      <w:r>
+        <w:t>Audits SEO complémentaires lancés le 26/06/2026</w:t>
+      </w:r>
+    </w:p>
+    <w:p>
+      <w:r>
+        <w:t>Audit SEO global (Health score 72/100) → livrables/challenge-1/seo-audit-2026-06-26.md.</w:t>
+      </w:r>
+    </w:p>
+    <w:p>
+      <w:r>
+        <w:t>Audit page-par-page sur 5 pages clés (home + 3 services + à-propos) → livrables/challenge-1/seo-page-{home,services-seo,services-automatisation,services-optimisation-site,a-propos}-2026-06-26.md.</w:t>
+      </w:r>
+    </w:p>
+    <w:p>
+      <w:pPr>
+        <w:pStyle w:val="Heading2"/>
+      </w:pPr>
+      <w:r>
+        <w:t>Issues critiques nouvellement identifiées</w:t>
+      </w:r>
+    </w:p>
+    <w:p>
+      <w:r>
+        <w:t>(1) llms.txt absent — alors que la stratégie GEO l'annonce et que robots.txt autorise déjà les bots IA. À créer. (2) Schéma FAQPage toujours présent sur la home et les pages services — incompatible avec la doctrine CLAUDE.md §SEO-STRATEGY. À retirer. (3) areaServed limité à France — incohérent avec la cible brief (FR/BE/CH/LU). À étendre. (4) Title /a-propos/ génère un doublon de marque. À reformuler. (5) Person.sameAs ne contient qu'un seul profil — viser 3-5 profils pour le Knowledge Graph.</w:t>
+      </w:r>
+    </w:p>
+    <w:p>
+      <w:pPr>
+        <w:pStyle w:val="Heading2"/>
+      </w:pPr>
+      <w:r>
+        <w:t>Clustering enrichi et plan de contenu</w:t>
+      </w:r>
+    </w:p>
+    <w:p>
+      <w:r>
+        <w:t>Cinq clusters identifiés : (a) Acquisition « agence IA pour OF », (b) SEO B2B niche « SEO organisme de formation », (c) Qualiopi &amp; administratif, (d) Pédagogie &amp; contenu, (e) Conformité légale (BPF/RGPD/NDA). Voir livrables/challenge-1/keyword-clusters-2026-06-26.md.</w:t>
+      </w:r>
+    </w:p>
+    <w:p>
+      <w:r>
+        <w:t>Trois mots-clés à capturer en priorité (B5-bis) : « agence SEO organisme de formation » (H1 /services/seo/), « automatisation Qualiopi » (title /services/automatisation/), « Julien Rayes Claude Agency » (title /a-propos/). Un article éditorial restant à écrire prioritairement : automatiser-qualiopi-ia.mdx.</w:t>
+      </w:r>
+    </w:p>
+    <w:p>
+      <w:pPr>
+        <w:pStyle w:val="Heading2"/>
+      </w:pPr>
+      <w:r>
+        <w:t>Visibilité dans les IA (GEO) — mise à jour</w:t>
+      </w:r>
+    </w:p>
+    <w:p>
+      <w:r>
+        <w:t>Score GEO actuel 55/100. Avec 3 actions &lt;30 min cumulées (créer llms.txt, ajouter ProfessionalService à Organization, enrichir Person.sameAs), le score remonte à ~75/100. Voir livrables/challenge-1/ai-visibility-2026-06-26.md.</w:t>
+      </w:r>
+    </w:p>
+    <w:p>
+      <w:pPr>
+        <w:pStyle w:val="Heading2"/>
+      </w:pPr>
+      <w:r>
+        <w:t>Confirmation du ciblage Qualiopi / IA / OF</w:t>
+      </w:r>
+    </w:p>
+    <w:p>
+      <w:r>
+        <w:t>Le plan cible explicitement les organismes de formation Qualiopi (§3 clusters, §4 quick wins, §5 GEO). Aucun ajout nécessaire sur ce point — déjà couvert dans la version initiale du 24/06/2026.</w:t>
+      </w:r>
+    </w:p>
+    <w:p>
+      <w:pPr>
+        <w:pStyle w:val="Heading2"/>
+      </w:pPr>
+      <w:r>
+        <w:t>Application directe sur le site (B5-bis)</w:t>
+      </w:r>
+    </w:p>
+    <w:p>
+      <w:r>
+        <w:t>Conformément au critère brief « actions concrètes, priorisées et directement appliquées sur le site », les 5 actions ci-dessous sont appliquées en commits séparés sur la branche feature/seo-gap-pass et listées dans le rapport final RAPPORT-GAP-PASS-2026-06-26.md.</w:t>
+      </w:r>
+    </w:p>
+    <w:p>
+      <w:r>
+        <w:t>(1) Créer app/public/llms.txt. (2) Retirer faqSchema de la home et des services. (3) Corriger title /a-propos/. (4) Étendre areaServed à FR/BE/CH/LU. (5) Enrichir AUTHOR_SAMEAS avec 2-3 profils additionnels.</w:t>
       </w:r>
     </w:p>
     <w:sectPr>

</xml_diff>